<commit_message>
work on ms -- section on atttribution is unreliable
</commit_message>
<xml_diff>
--- a/ms-2026-05-29v2.docx
+++ b/ms-2026-05-29v2.docx
@@ -852,20 +852,12 @@
         <w:rPr>
           <w:rFonts w:hint="eastAsia"/>
         </w:rPr>
-        <w:t>(Alexandrov et al. 2020, 2014; Nik-Zainal et al. 2012; Degasperi et al. 2022; Chen et al. 2024; Jin et al. 2024; Koh et al. 2025)</w:t>
+        <w:t>(Alexandrov et al. 2020, 2014; Nik-Zainal et al. 2012; Degasperi et al. 2022a; Chen et al. 2024; Jin et al. 2024; Koh et al. 2025)</w:t>
       </w:r>
       <w:bookmarkEnd w:id="4"/>
       <w:r>
         <w:rPr/>
-        <w:t>.</w:t>
-      </w:r>
-      <w:r>
-        <w:rPr/>
-        <w:t xml:space="preserve"> </w:t>
-      </w:r>
-      <w:r>
-        <w:rPr/>
-        <w:t>For example, data mining of upper tract urothelial cancers (UTUC) from Taiwan initially identified the aristolochic acid (AA) single-base substitution (SBS) signature</w:t>
+        <w:t>. For example, data mining of upper tract urothelial cancers (UTUC) from Taiwan initially identified the aristolochic acid (AA) single-base substitution (SBS) signature</w:t>
       </w:r>
       <w:r>
         <w:rPr>
@@ -1173,11 +1165,7 @@
       </w:pPr>
       <w:r>
         <w:rPr/>
-        <w:t>One of the new classification schemes is based on 476 types of indel and one is based on 89 types, which mainly consolidates similar mutation types in the 476-type classification into coarser-grained mutation type</w:t>
-      </w:r>
-      <w:r>
-        <w:rPr/>
-        <w:t xml:space="preserve">s </w:t>
+        <w:t xml:space="preserve">One of the new classification schemes is based on 476 types of indel and one is based on 89 types, which mainly consolidates similar mutation types in the 476-type classification into coarser-grained mutation types </w:t>
       </w:r>
       <w:bookmarkStart w:id="11" w:name="ZOTERO_BREF_DSm1vQOtZRZy"/>
       <w:r>
@@ -1525,11 +1513,7 @@
       </w:r>
       <w:r>
         <w:rPr/>
-        <w:t xml:space="preserve"> cosine similarity, and 39 of the signatures had tumor spectra with &gt; 0.90 similarity (Table 1). Of the 44 signatures identified in the 89-type classification, similar signatures were previously described </w:t>
-      </w:r>
-      <w:r>
-        <w:rPr/>
-        <w:t xml:space="preserve">for 18 </w:t>
+        <w:t xml:space="preserve"> cosine similarity, and 39 of the signatures had tumor spectra with &gt; 0.90 similarity (Table 1). Of the 44 signatures identified in the 89-type classification, similar signatures were previously described for 18 </w:t>
       </w:r>
       <w:bookmarkStart w:id="14" w:name="ZOTERO_BREF_0qMQgAENxeSA"/>
       <w:r>
@@ -1539,11 +1523,7 @@
       <w:bookmarkEnd w:id="14"/>
       <w:r>
         <w:rPr/>
-        <w:t xml:space="preserve">. </w:t>
-      </w:r>
-      <w:r>
-        <w:rPr/>
-        <w:t xml:space="preserve">We also carried out signature discovery in spectra in the 83-type classification, and discovered 34 signatures, of which 20 were similar to signatures in the COSMIC reference set, and 3 additional signatures were similar to signatures identified in </w:t>
+        <w:t xml:space="preserve">. We also carried out signature discovery in spectra in the 83-type classification, and discovered 34 signatures, of which 20 were similar to signatures in the COSMIC reference set, and 3 additional signatures were similar to signatures identified in </w:t>
       </w:r>
       <w:bookmarkStart w:id="15" w:name="ZOTERO_BREF_RenPiKIXIJyQ"/>
       <w:r>
@@ -1618,15 +1598,7 @@
       </w:r>
       <w:r>
         <w:rPr/>
-        <w:t xml:space="preserve"> 6 Ts, which in the older, 83 type classification, constitute a single class of &gt; 8.5 million </w:t>
-      </w:r>
-      <w:r>
-        <w:rPr/>
-        <w:t>deletions out of 9.5 million deletions of a single T and out of 18.4 million deletions in total</w:t>
-      </w:r>
-      <w:r>
-        <w:rPr/>
-        <w:t xml:space="preserve">. In COSMIC reference signature ID2 in the 83-type classification consists exclusively of this class of deletions. The new indel classifications divide ID2 into three signatures. Among these, InsDel2b is dominated by deletions of T from tracts of 5 to 7 Ts. InsDel2a and InsDel2c are dominated by deletions of </w:t>
+        <w:t xml:space="preserve"> 6 Ts, which in the older, 83 type classification, constitute a single class of &gt; 8.5 million deletions out of 9.5 million deletions of a single T and out of 18.4 million deletions in total. In COSMIC reference signature ID2 in the 83-type classification consists exclusively of this class of deletions. The new indel classifications divide ID2 into three signatures. Among these, InsDel2b is dominated by deletions of T from tracts of 5 to 7 Ts. InsDel2a and InsDel2c are dominated by deletions of </w:t>
       </w:r>
       <w:r>
         <w:rPr>
@@ -1739,7 +1711,7 @@
         <w:rPr>
           <w:rFonts w:eastAsia="宋体" w:hint="eastAsia"/>
         </w:rPr>
-        <w:t>C. These are nearly identical in the 89-type system, which groups deletions of single Ts in stretches of 1, 2, 3, or 4 Ts as a single deletion type. However the 83 and 476 type systems show that InsDel</w:t>
+        <w:t>C. These are nearly identical in the 89-type system, which classifies deletions of single Ts in stretches of 1, 2, 3, or 4 Ts as a single deletion type. However the 83 and 476 type systems show that InsDel</w:t>
       </w:r>
       <w:r>
         <w:rPr>
@@ -1939,17 +1911,7 @@
           <w:i/>
           <w:iCs/>
         </w:rPr>
-        <w:t xml:space="preserve">APOBEC3A activity and </w:t>
-      </w:r>
-      <w:r>
-        <w:rPr>
-          <w:rFonts w:eastAsia="宋体"/>
-          <w:b/>
-          <w:bCs/>
-          <w:i/>
-          <w:iCs/>
-        </w:rPr>
-        <w:t>InsDel_Aβ</w:t>
+        <w:t>APOBEC3A activity and InsDel_Aβ</w:t>
       </w:r>
       <w:r>
         <w:rPr>
@@ -1965,25 +1927,61 @@
         <w:rPr>
           <w:rFonts w:eastAsia="宋体"/>
         </w:rPr>
-        <w:t xml:space="preserve">We identified InsDel_Aβ, an indel signature </w:t>
+        <w:t>We identified InsDel_Aβ, an indel signature that in the 476-type classification consists primarily of 1 bp C deletions TCA</w:t>
+      </w:r>
+      <w:r>
+        <w:rPr>
+          <w:rFonts w:eastAsia="DejaVu Sans" w:hint="eastAsia"/>
+        </w:rPr>
+        <w:t>→</w:t>
       </w:r>
       <w:r>
         <w:rPr>
           <w:rFonts w:eastAsia="宋体"/>
         </w:rPr>
-        <w:t xml:space="preserve">that in the 476-type classification consists primarily of </w:t>
+        <w:t>TA and TCT</w:t>
+      </w:r>
+      <w:r>
+        <w:rPr>
+          <w:rFonts w:eastAsia="DejaVu Sans" w:hint="eastAsia"/>
+        </w:rPr>
+        <w:t>→</w:t>
       </w:r>
       <w:r>
         <w:rPr>
           <w:rFonts w:eastAsia="宋体"/>
         </w:rPr>
-        <w:t xml:space="preserve">1 bp C deletions </w:t>
+        <w:t>TT deletions</w:t>
+      </w:r>
+      <w:r>
+        <w:rPr>
+          <w:rFonts w:eastAsia="宋体" w:hint="eastAsia"/>
+        </w:rPr>
+        <w:t xml:space="preserve"> (F</w:t>
       </w:r>
       <w:r>
         <w:rPr>
           <w:rFonts w:eastAsia="宋体"/>
         </w:rPr>
-        <w:t>TCA</w:t>
+        <w:t>i</w:t>
+      </w:r>
+      <w:r>
+        <w:rPr>
+          <w:rFonts w:eastAsia="宋体" w:hint="eastAsia"/>
+        </w:rPr>
+        <w:t>gure S1C, right sub-panel</w:t>
+      </w:r>
+      <w:r>
+        <w:rPr>
+          <w:rFonts w:eastAsia="宋体"/>
+        </w:rPr>
+        <w:t xml:space="preserve">). Thus, InsDel_Aβ mutates the same sequences as SBS2 </w:t>
+      </w:r>
+      <w:r>
+        <w:rPr>
+          <w:rFonts w:eastAsia="宋体" w:hint="eastAsia"/>
+        </w:rPr>
+        <w:t>(TCA</w:t>
       </w:r>
       <w:r>
         <w:rPr>
@@ -1993,9 +1991,63 @@
       </w:r>
       <w:r>
         <w:rPr>
+          <w:rFonts w:eastAsia="宋体" w:hint="eastAsia"/>
+        </w:rPr>
+        <w:t>TTA and TCT</w:t>
+      </w:r>
+      <w:r>
+        <w:rPr>
+          <w:rFonts w:eastAsia="DejaVu Sans" w:cs="DejaVu Sans" w:hint="eastAsia" w:ascii="DejaVu Sans" w:hAnsi="DejaVu Sans"/>
+        </w:rPr>
+        <w:t>→</w:t>
+      </w:r>
+      <w:r>
+        <w:rPr>
+          <w:rFonts w:eastAsia="宋体" w:hint="eastAsia"/>
+        </w:rPr>
+        <w:t>TTT)</w:t>
+      </w:r>
+      <w:r>
+        <w:rPr>
           <w:rFonts w:eastAsia="宋体"/>
         </w:rPr>
-        <w:t>TA and TCT</w:t>
+        <w:t xml:space="preserve"> and SBS13 </w:t>
+      </w:r>
+      <w:r>
+        <w:rPr>
+          <w:rFonts w:eastAsia="宋体" w:hint="eastAsia"/>
+        </w:rPr>
+        <w:t>(TCA</w:t>
+      </w:r>
+      <w:r>
+        <w:rPr>
+          <w:rFonts w:eastAsia="DejaVu Sans" w:cs="DejaVu Sans" w:hint="eastAsia" w:ascii="DejaVu Sans" w:hAnsi="DejaVu Sans"/>
+        </w:rPr>
+        <w:t>→</w:t>
+      </w:r>
+      <w:r>
+        <w:rPr>
+          <w:rFonts w:eastAsia="宋体" w:hint="eastAsia"/>
+        </w:rPr>
+        <w:t>TGA and TCT</w:t>
+      </w:r>
+      <w:r>
+        <w:rPr>
+          <w:rFonts w:eastAsia="DejaVu Sans" w:cs="DejaVu Sans" w:hint="eastAsia" w:ascii="DejaVu Sans" w:hAnsi="DejaVu Sans"/>
+        </w:rPr>
+        <w:t>→</w:t>
+      </w:r>
+      <w:r>
+        <w:rPr>
+          <w:rFonts w:eastAsia="宋体" w:hint="eastAsia"/>
+        </w:rPr>
+        <w:t>TGT)</w:t>
+      </w:r>
+      <w:r>
+        <w:rPr>
+          <w:rFonts w:eastAsia="宋体"/>
+        </w:rPr>
+        <w:t>, which are canonical APOBEC SBS signatures, and experiments in cell culture have shown that APOBEC3A induces primarily TC</w:t>
       </w:r>
       <w:r>
         <w:rPr>
@@ -2007,383 +2059,84 @@
         <w:rPr>
           <w:rFonts w:eastAsia="宋体"/>
         </w:rPr>
-        <w:t>TT deletions</w:t>
+        <w:t xml:space="preserve">T mutations </w:t>
+      </w:r>
+      <w:bookmarkStart w:id="16" w:name="ZOTERO_BREF_CAdMe2IeGVl5"/>
+      <w:r>
+        <w:rPr>
+          <w:rFonts w:eastAsia="宋体"/>
+        </w:rPr>
+        <w:t>(DeWeerd et al. 2022)</w:t>
+      </w:r>
+      <w:bookmarkEnd w:id="16"/>
+      <w:r>
+        <w:rPr>
+          <w:rFonts w:eastAsia="宋体"/>
+        </w:rPr>
+        <w:t xml:space="preserve">. This signature was was also noted in </w:t>
+      </w:r>
+      <w:bookmarkStart w:id="17" w:name="ZOTERO_BREF_EcFI6Fskdsau"/>
+      <w:r>
+        <w:rPr>
+          <w:rFonts w:eastAsia="宋体"/>
+        </w:rPr>
+        <w:t>(Koh et al. 2025)</w:t>
+      </w:r>
+      <w:bookmarkEnd w:id="17"/>
+      <w:r>
+        <w:rPr>
+          <w:rFonts w:eastAsia="宋体"/>
+        </w:rPr>
+        <w:t xml:space="preserve">. In parallel, we discovered the corresponding 83-type indel signature, ID_A, which, compared to C_ID9, is more similar to </w:t>
       </w:r>
       <w:r>
         <w:rPr>
           <w:rFonts w:eastAsia="宋体" w:hint="eastAsia"/>
         </w:rPr>
+        <w:t>the experimental indel spectrum in</w:t>
+      </w:r>
+      <w:r>
+        <w:rPr>
+          <w:rFonts w:eastAsia="宋体"/>
+        </w:rPr>
         <w:t xml:space="preserve"> </w:t>
       </w:r>
+      <w:bookmarkStart w:id="18" w:name="ZOTERO_BREF_PIzfJaCA5fo2"/>
+      <w:r>
+        <w:rPr>
+          <w:rFonts w:eastAsia="宋体"/>
+        </w:rPr>
+        <w:t>(DeWeerd et al. 2022)</w:t>
+      </w:r>
+      <w:bookmarkEnd w:id="18"/>
+      <w:r>
+        <w:rPr/>
+        <w:t>.</w:t>
+      </w:r>
       <w:r>
         <w:rPr>
           <w:rFonts w:eastAsia="宋体" w:hint="eastAsia"/>
         </w:rPr>
+        <w:t xml:space="preserve"> Notably compared to ID9, </w:t>
+      </w:r>
+      <w:r>
+        <w:rPr>
+          <w:rFonts w:eastAsia="宋体"/>
+        </w:rPr>
+        <w:t xml:space="preserve">ID_A lacks the prominent 1 bp T deletions present in C_ID9 </w:t>
+      </w:r>
+      <w:r>
+        <w:rPr>
+          <w:rFonts w:eastAsia="宋体" w:hint="eastAsia"/>
+        </w:rPr>
         <w:t>(</w:t>
       </w:r>
       <w:r>
         <w:rPr>
           <w:rFonts w:eastAsia="宋体" w:hint="eastAsia"/>
-        </w:rPr>
-        <w:t>F</w:t>
-      </w:r>
-      <w:r>
-        <w:rPr>
-          <w:rFonts w:eastAsia="宋体"/>
-        </w:rPr>
-        <w:t>i</w:t>
-      </w:r>
-      <w:r>
-        <w:rPr>
-          <w:rFonts w:eastAsia="宋体" w:hint="eastAsia"/>
-        </w:rPr>
-        <w:t xml:space="preserve">gure S1C, </w:t>
-      </w:r>
-      <w:r>
-        <w:rPr>
-          <w:rFonts w:eastAsia="宋体" w:hint="eastAsia"/>
-        </w:rPr>
-        <w:t>right</w:t>
-      </w:r>
-      <w:r>
-        <w:rPr>
-          <w:rFonts w:eastAsia="宋体" w:hint="eastAsia"/>
-        </w:rPr>
-        <w:t xml:space="preserve"> sub-panel</w:t>
-      </w:r>
-      <w:r>
-        <w:rPr>
-          <w:rFonts w:eastAsia="宋体"/>
-        </w:rPr>
-        <w:t>). Th</w:t>
-      </w:r>
-      <w:r>
-        <w:rPr>
-          <w:rFonts w:eastAsia="宋体"/>
-        </w:rPr>
-        <w:t>us, InsDel_Aβ mutates the same sequences a</w:t>
-      </w:r>
-      <w:r>
-        <w:rPr>
-          <w:rFonts w:eastAsia="宋体"/>
-        </w:rPr>
-        <w:t>s</w:t>
-      </w:r>
-      <w:r>
-        <w:rPr>
-          <w:rFonts w:eastAsia="宋体"/>
-        </w:rPr>
-        <w:t xml:space="preserve"> </w:t>
-      </w:r>
-      <w:r>
-        <w:rPr>
-          <w:rFonts w:eastAsia="宋体"/>
-        </w:rPr>
-        <w:t xml:space="preserve">SBS2 </w:t>
-      </w:r>
-      <w:r>
-        <w:rPr>
-          <w:rFonts w:eastAsia="宋体" w:hint="eastAsia"/>
-        </w:rPr>
-        <w:t>(TCA</w:t>
-      </w:r>
-      <w:r>
-        <w:rPr>
-          <w:rFonts w:eastAsia="DejaVu Sans" w:hint="eastAsia"/>
-        </w:rPr>
-        <w:t>→</w:t>
-      </w:r>
-      <w:r>
-        <w:rPr>
-          <w:rFonts w:eastAsia="宋体" w:hint="eastAsia"/>
-        </w:rPr>
-        <w:t xml:space="preserve">TTA </w:t>
-      </w:r>
-      <w:r>
-        <w:rPr>
-          <w:rFonts w:eastAsia="宋体" w:hint="eastAsia"/>
-        </w:rPr>
-        <w:t>and</w:t>
-      </w:r>
-      <w:r>
-        <w:rPr>
-          <w:rFonts w:eastAsia="宋体" w:hint="eastAsia"/>
-        </w:rPr>
-        <w:t xml:space="preserve"> TCT</w:t>
-      </w:r>
-      <w:r>
-        <w:rPr>
-          <w:rFonts w:eastAsia="DejaVu Sans" w:cs="DejaVu Sans" w:hint="eastAsia" w:ascii="DejaVu Sans" w:hAnsi="DejaVu Sans"/>
-        </w:rPr>
-        <w:t>→</w:t>
-      </w:r>
-      <w:r>
-        <w:rPr>
-          <w:rFonts w:eastAsia="宋体" w:hint="eastAsia"/>
-        </w:rPr>
-        <w:t>TTT)</w:t>
-      </w:r>
-      <w:r>
-        <w:rPr>
-          <w:rFonts w:eastAsia="宋体"/>
-        </w:rPr>
-        <w:t xml:space="preserve"> and SBS13 </w:t>
-      </w:r>
-      <w:r>
-        <w:rPr>
-          <w:rFonts w:eastAsia="宋体" w:hint="eastAsia"/>
-        </w:rPr>
-        <w:t>(TCA</w:t>
-      </w:r>
-      <w:r>
-        <w:rPr>
-          <w:rFonts w:eastAsia="DejaVu Sans" w:cs="DejaVu Sans" w:hint="eastAsia" w:ascii="DejaVu Sans" w:hAnsi="DejaVu Sans"/>
-        </w:rPr>
-        <w:t>→</w:t>
-      </w:r>
-      <w:r>
-        <w:rPr>
-          <w:rFonts w:eastAsia="宋体" w:hint="eastAsia"/>
-        </w:rPr>
-        <w:t xml:space="preserve">TGA </w:t>
-      </w:r>
-      <w:r>
-        <w:rPr>
-          <w:rFonts w:eastAsia="宋体" w:hint="eastAsia"/>
-        </w:rPr>
-        <w:t>and</w:t>
-      </w:r>
-      <w:r>
-        <w:rPr>
-          <w:rFonts w:eastAsia="宋体" w:hint="eastAsia"/>
-        </w:rPr>
-        <w:t xml:space="preserve"> TCT</w:t>
-      </w:r>
-      <w:r>
-        <w:rPr>
-          <w:rFonts w:eastAsia="DejaVu Sans" w:cs="DejaVu Sans" w:hint="eastAsia" w:ascii="DejaVu Sans" w:hAnsi="DejaVu Sans"/>
-        </w:rPr>
-        <w:t>→</w:t>
-      </w:r>
-      <w:r>
-        <w:rPr>
-          <w:rFonts w:eastAsia="宋体" w:hint="eastAsia"/>
-        </w:rPr>
-        <w:t>TGT)</w:t>
-      </w:r>
-      <w:r>
-        <w:rPr>
-          <w:rFonts w:eastAsia="宋体"/>
-        </w:rPr>
-        <w:t xml:space="preserve">, which are canonical APOBEC SBS signatures, </w:t>
-      </w:r>
-      <w:r>
-        <w:rPr>
-          <w:rFonts w:eastAsia="宋体"/>
-        </w:rPr>
-        <w:t>and experiments in cell culture have shown that APOBEC3A induces primarily TC</w:t>
-      </w:r>
-      <w:r>
-        <w:rPr>
-          <w:rFonts w:eastAsia="DejaVu Sans" w:hint="eastAsia"/>
-        </w:rPr>
-        <w:t>→</w:t>
-      </w:r>
-      <w:r>
-        <w:rPr>
-          <w:rFonts w:eastAsia="宋体"/>
-        </w:rPr>
-        <w:t xml:space="preserve">T mutations </w:t>
-      </w:r>
-      <w:bookmarkStart w:id="16" w:name="ZOTERO_BREF_CAdMe2IeGVl5"/>
-      <w:r>
-        <w:rPr>
-          <w:rFonts w:eastAsia="宋体"/>
-        </w:rPr>
-        <w:t>(DeWeerd et al. 2022)</w:t>
-      </w:r>
-      <w:bookmarkEnd w:id="16"/>
-      <w:r>
-        <w:rPr>
-          <w:rFonts w:eastAsia="宋体"/>
-        </w:rPr>
-        <w:t xml:space="preserve">. </w:t>
-      </w:r>
-      <w:r>
-        <w:rPr>
-          <w:rFonts w:eastAsia="宋体"/>
-        </w:rPr>
-        <w:t>This</w:t>
-      </w:r>
-      <w:r>
-        <w:rPr>
-          <w:rFonts w:eastAsia="宋体"/>
-        </w:rPr>
-        <w:t xml:space="preserve"> </w:t>
-      </w:r>
-      <w:r>
-        <w:rPr>
-          <w:rFonts w:eastAsia="宋体"/>
-        </w:rPr>
-        <w:t xml:space="preserve">signature was was also noted in </w:t>
-      </w:r>
-      <w:bookmarkStart w:id="17" w:name="ZOTERO_BREF_EcFI6Fskdsau"/>
-      <w:r>
-        <w:rPr>
-          <w:rFonts w:eastAsia="宋体"/>
-        </w:rPr>
-        <w:t>(Koh et al. 2025)</w:t>
-      </w:r>
-      <w:bookmarkEnd w:id="17"/>
-      <w:r>
-        <w:rPr>
-          <w:rFonts w:eastAsia="宋体"/>
-        </w:rPr>
-        <w:t xml:space="preserve">. </w:t>
-      </w:r>
-      <w:r>
-        <w:rPr>
-          <w:rFonts w:eastAsia="宋体"/>
-        </w:rPr>
-        <w:t xml:space="preserve">In parallel, we discovered </w:t>
-      </w:r>
-      <w:r>
-        <w:rPr>
-          <w:rFonts w:eastAsia="宋体"/>
-        </w:rPr>
-        <w:t xml:space="preserve">the corresponding </w:t>
-      </w:r>
-      <w:r>
-        <w:rPr>
-          <w:rFonts w:eastAsia="宋体"/>
-        </w:rPr>
-        <w:t>83-</w:t>
-      </w:r>
-      <w:r>
-        <w:rPr>
-          <w:rFonts w:eastAsia="宋体"/>
-        </w:rPr>
-        <w:t xml:space="preserve">type </w:t>
-      </w:r>
-      <w:r>
-        <w:rPr>
-          <w:rFonts w:eastAsia="宋体"/>
-        </w:rPr>
-        <w:t xml:space="preserve">indel signature, ID_A, which, </w:t>
-      </w:r>
-      <w:r>
-        <w:rPr>
-          <w:rFonts w:eastAsia="宋体"/>
-        </w:rPr>
-        <w:t>compared to C_ID9,</w:t>
-      </w:r>
-      <w:r>
-        <w:rPr>
-          <w:rFonts w:eastAsia="宋体"/>
-        </w:rPr>
-        <w:t xml:space="preserve"> </w:t>
-      </w:r>
-      <w:r>
-        <w:rPr>
-          <w:rFonts w:eastAsia="宋体"/>
-        </w:rPr>
-        <w:t>is more similar</w:t>
-      </w:r>
-      <w:r>
-        <w:rPr>
-          <w:rFonts w:eastAsia="宋体"/>
-        </w:rPr>
-        <w:t xml:space="preserve"> to </w:t>
-      </w:r>
-      <w:r>
-        <w:rPr>
-          <w:rFonts w:eastAsia="宋体" w:hint="eastAsia"/>
-        </w:rPr>
-        <w:t xml:space="preserve">the </w:t>
-      </w:r>
-      <w:r>
-        <w:rPr>
-          <w:rFonts w:eastAsia="宋体" w:hint="eastAsia"/>
-        </w:rPr>
-        <w:t xml:space="preserve">experimental </w:t>
-      </w:r>
-      <w:r>
-        <w:rPr>
-          <w:rFonts w:eastAsia="宋体" w:hint="eastAsia"/>
-        </w:rPr>
-        <w:t xml:space="preserve">indel spectrum </w:t>
-      </w:r>
-      <w:r>
-        <w:rPr>
-          <w:rFonts w:eastAsia="宋体" w:hint="eastAsia"/>
-        </w:rPr>
-        <w:t>in</w:t>
-      </w:r>
-      <w:r>
-        <w:rPr>
-          <w:rFonts w:eastAsia="宋体"/>
-        </w:rPr>
-        <w:t xml:space="preserve"> </w:t>
-      </w:r>
-      <w:bookmarkStart w:id="18" w:name="ZOTERO_BREF_PIzfJaCA5fo2"/>
-      <w:r>
-        <w:rPr>
-          <w:rFonts w:eastAsia="宋体"/>
-        </w:rPr>
-        <w:t>(DeWeerd et al. 2022)</w:t>
-      </w:r>
-      <w:bookmarkEnd w:id="18"/>
-      <w:r>
-        <w:rPr/>
-        <w:t>.</w:t>
-      </w:r>
-      <w:r>
-        <w:rPr>
-          <w:rFonts w:eastAsia="宋体" w:hint="eastAsia"/>
-        </w:rPr>
-        <w:t xml:space="preserve"> </w:t>
-      </w:r>
-      <w:r>
-        <w:rPr>
-          <w:rFonts w:eastAsia="宋体" w:hint="eastAsia"/>
-        </w:rPr>
-        <w:t>Notably c</w:t>
-      </w:r>
-      <w:r>
-        <w:rPr>
-          <w:rFonts w:eastAsia="宋体" w:hint="eastAsia"/>
-        </w:rPr>
-        <w:t xml:space="preserve">ompared to ID9, </w:t>
-      </w:r>
-      <w:r>
-        <w:rPr>
-          <w:rFonts w:eastAsia="宋体"/>
-        </w:rPr>
-        <w:t xml:space="preserve">ID_A </w:t>
-      </w:r>
-      <w:r>
-        <w:rPr>
-          <w:rFonts w:eastAsia="宋体"/>
-        </w:rPr>
-        <w:t xml:space="preserve">lacks the prominent </w:t>
-      </w:r>
-      <w:r>
-        <w:rPr>
-          <w:rFonts w:eastAsia="宋体"/>
-        </w:rPr>
-        <w:t xml:space="preserve">1 bp T deletions </w:t>
-      </w:r>
-      <w:r>
-        <w:rPr>
-          <w:rFonts w:eastAsia="宋体"/>
-        </w:rPr>
-        <w:t xml:space="preserve">present in C_ID9 </w:t>
-      </w:r>
-      <w:r>
-        <w:rPr>
-          <w:rFonts w:eastAsia="宋体" w:hint="eastAsia"/>
-        </w:rPr>
-        <w:t>(Figure S1C, left sub-panel)</w:t>
+          <w:shd w:fill="00FFFF" w:val="clear"/>
+        </w:rPr>
+        <w:t>Figure S1C, left sub-panel)</w:t>
       </w:r>
       <w:r>
         <w:rPr>
@@ -2470,33 +2223,174 @@
         </w:numPr>
         <w:ind w:hanging="0" w:left="0"/>
         <w:rPr>
+          <w:highlight w:val="none"/>
+          <w:shd w:fill="FF0000" w:val="clear"/>
+        </w:rPr>
+      </w:pPr>
+      <w:r>
+        <w:rPr>
+          <w:shd w:fill="FF0000" w:val="clear"/>
+        </w:rPr>
+        <w:t>Attribution of signatures across cancer types</w:t>
+      </w:r>
+      <w:r>
+        <w:rPr>
           <w:i/>
           <w:iCs/>
           <w:sz w:val="24"/>
           <w:szCs w:val="24"/>
-        </w:rPr>
-      </w:pPr>
-      <w:commentRangeStart w:id="0"/>
+          <w:shd w:fill="FF0000" w:val="clear"/>
+        </w:rPr>
+        <w:t xml:space="preserve"> </w:t>
+      </w:r>
       <w:r>
         <w:rPr>
           <w:i/>
           <w:iCs/>
           <w:sz w:val="24"/>
           <w:szCs w:val="24"/>
-        </w:rPr>
-        <w:t>Associations between indel signatures and SBS signatures &lt;FOR STEVE TO REVIEW&gt;</w:t>
-      </w:r>
-      <w:commentRangeEnd w:id="0"/>
-      <w:r>
-        <w:commentReference w:id="0"/>
-      </w:r>
-      <w:r>
+          <w:shd w:fill="FF0000" w:val="clear"/>
+        </w:rPr>
+        <w:t>NOT CHECKED</w:t>
+      </w:r>
+    </w:p>
+    <w:p>
+      <w:pPr>
+        <w:pStyle w:val="Normal"/>
+        <w:rPr/>
+      </w:pPr>
+      <w:bookmarkStart w:id="19" w:name="ZOTERO_BREF_OgOQIXgFsieu"/>
+      <w:bookmarkEnd w:id="19"/>
+      <w:r>
+        <w:rPr/>
+        <w:t>To examine how signature activity is distributed across tumor types we combined per-genome attributions (Methods) with cancer-type-level prevalence and enrichment analyses (Figure 4a, 4b, Figure 5B, 5C, Tables S15, S17). The 83-type and 89-type taxonomies give broadly consistent pictures, but the 89-type refinement separates broadly-active components of C_ID1 and C_ID2 from microsatellite-instability (MSI) components that the 83-type system collapses. This separation is the main practical gain of the new taxonomy at the attribution level.</w:t>
+      </w:r>
+    </w:p>
+    <w:p>
+      <w:pPr>
+        <w:pStyle w:val="Normal"/>
+        <w:rPr/>
+      </w:pPr>
+      <w:bookmarkStart w:id="20" w:name="ZOTERO_BREF_OgOQIXgFsieu_Copy_1"/>
+      <w:bookmarkEnd w:id="20"/>
+      <w:r>
+        <w:rPr/>
+        <w:t>A small number of signatures are present across essentially every cancer type. C_ID1 and InsDel1a, C_ID5 and InsDel5a, InsDel_B, and InsDel_Nβ are detected in nearly all tissues at moderate exposures. Their pan-cancer distribution and their correlation with patient age in multiple tissues (see Demographic Associations, below) is consistent with clock-like behavior. InsDel_Nβ is the broadly-distributed counterpart of the new ID_N split: the POLE- and MMR-restricted InsDel_Nα is separated from InsDel_Nβ only by the 89- and 476-type taxonomies, illustrating again the resolution gain over the 83-type scheme.</w:t>
+      </w:r>
+    </w:p>
+    <w:p>
+      <w:pPr>
+        <w:pStyle w:val="Normal"/>
+        <w:rPr/>
+      </w:pPr>
+      <w:bookmarkStart w:id="21" w:name="ZOTERO_BREF_OgOQIXgFsieu_Copy_2"/>
+      <w:bookmarkEnd w:id="21"/>
+      <w:r>
+        <w:rPr/>
+        <w:t>Most other signatures are restricted to one or a few cancer types (Figure 4, Figure 5B, 5C). Tobacco-associated InsDel3b and C_ID3 are enriched in lung, with secondary enrichment in head/neck and esophagus, paralleling the SBS4 and SBS92 correlations described below. InsDel_B, InsDel5a, and InsDel5b are concentrated in liver and correlate with SBS12 and SBS16, defining a hepatocellular slow-clock attribution pattern. InsDel3a shows enrichment in bladder, consistent with aristolochic-acid exposure. C_ID18 and the associated InsDel18 are enriched in colon and esophagus, consistent with colibactin exposure, while InsDel14 and C_ID14 are enriched in the same tissues and correlate with SBS93 (Figure 5A). ID_A and InsDel_Aβ, the APOBEC3A indel signatures discussed above, are enriched in breast and bladder, mirroring the canonical SBS2 and SBS13 tissue distribution.</w:t>
+      </w:r>
+    </w:p>
+    <w:p>
+      <w:pPr>
+        <w:pStyle w:val="Normal"/>
+        <w:rPr/>
+      </w:pPr>
+      <w:bookmarkStart w:id="22" w:name="ZOTERO_BREF_OgOQIXgFsieu_Copy_3"/>
+      <w:bookmarkEnd w:id="22"/>
+      <w:r>
+        <w:rPr/>
+        <w:t>InsDel_H is essentially confined to skin tumors. Its spectrum is dominated by two deletion classes in the 476-type scheme (Del(6,9):U(4,):R(2,9) and Del(7,9):M(6,)), consistent with UV-driven processing of long pyrimidine tracts. ID13 (UV) is also enriched in skin, as expected.</w:t>
+      </w:r>
+    </w:p>
+    <w:p>
+      <w:pPr>
+        <w:pStyle w:val="Normal"/>
+        <w:rPr/>
+      </w:pPr>
+      <w:bookmarkStart w:id="23" w:name="ZOTERO_BREF_OgOQIXgFsieu_Copy_4"/>
+      <w:bookmarkEnd w:id="23"/>
+      <w:r>
+        <w:rPr/>
+        <w:t>A coherent set of signatures is concentrated in MSI-H tumors. C_ID2, InsDel2b, InsDel2c, C_ID7, InsDel7, InsDel_D, InsDel_J, and InsDel_M are strongly enriched in MSI-H samples across uterus, colon, breast, prostate, and stomach (Figure 5B, 5C, Table S15). Two features of this MSI block depend on the 89-type taxonomy. First, deletions of a single T from poly-T tracts of length ≥ 6, which the 83-type system represents as a single class and which dominate COSMIC ID2, are split by the 89-type scheme into InsDel2a (broadly active, flanking A) and InsDel2b and InsDel2c (MSI-restricted, distinguished by flanking base composition). Second, the 89-type split of C_ID1 separates InsDel1a (pan-cancer, clock-like) from InsDel1b (POLE-proofreading-associated, Table S9) and InsDel1c (liver-cancer-associated). The 83-type system attributes all three to C_ID1 and therefore cannot resolve the MSI- and POLE-specific components from the slow-clock background.</w:t>
+      </w:r>
+    </w:p>
+    <w:p>
+      <w:pPr>
+        <w:pStyle w:val="Normal"/>
+        <w:rPr/>
+      </w:pPr>
+      <w:bookmarkStart w:id="24" w:name="ZOTERO_BREF_OgOQIXgFsieu_Copy_5"/>
+      <w:bookmarkEnd w:id="24"/>
+      <w:r>
+        <w:rPr/>
+        <w:t>Several signatures appear in fewer than ~20 tumors and only in one or two tissues: InsDel_C, InsDel_I, InsDel_K (pancreas, prostate, colon&lt;</w:t>
+      </w:r>
+      <w:r>
+        <w:rPr>
+          <w:shd w:fill="00FFFF" w:val="clear"/>
+        </w:rPr>
+        <w:t>correct in hamburger&gt;</w:t>
+      </w:r>
+      <w:r>
+        <w:rPr/>
+        <w:t xml:space="preserve">), InsDel_L (CNS, skin, pancreas </w:t>
+      </w:r>
+      <w:r>
+        <w:rPr>
+          <w:shd w:fill="00FFFF" w:val="clear"/>
+        </w:rPr>
+        <w:t>&lt;</w:t>
+      </w:r>
+      <w:r>
+        <w:rPr>
+          <w:shd w:fill="00FFFF" w:val="clear"/>
+        </w:rPr>
+        <w:t>correct in hamburger&gt;</w:t>
+      </w:r>
+      <w:r>
+        <w:rPr/>
+        <w:t xml:space="preserve">), and InsDel_M (lung, breast, colon, prostate, with strong MSI association </w:t>
+      </w:r>
+      <w:r>
+        <w:rPr>
+          <w:shd w:fill="00FFFF" w:val="clear"/>
+        </w:rPr>
+        <w:t>&lt;</w:t>
+      </w:r>
+      <w:r>
+        <w:rPr>
+          <w:shd w:fill="00FFFF" w:val="clear"/>
+        </w:rPr>
+        <w:t>correct in hamburger&gt;</w:t>
+      </w:r>
+      <w:r>
+        <w:rPr/>
+        <w:t>). InsDel11 is similarly rare. These should be interpreted as candidate processes pending replication in independent cohorts. We retain them because most show coherent tissue or MSI restriction and, in several cases, distinctive spectral features (for example, the POLE-proofreading association of InsDel_K and InsDel1b, Table S9).</w:t>
+      </w:r>
+    </w:p>
+    <w:p>
+      <w:pPr>
+        <w:pStyle w:val="Heading3"/>
+        <w:numPr>
+          <w:ilvl w:val="0"/>
+          <w:numId w:val="0"/>
+        </w:numPr>
+        <w:ind w:hanging="0" w:left="0"/>
         <w:rPr>
           <w:i/>
           <w:iCs/>
           <w:sz w:val="24"/>
           <w:szCs w:val="24"/>
         </w:rPr>
+      </w:pPr>
+      <w:r>
+        <w:rPr>
+          <w:i/>
+          <w:iCs/>
+          <w:sz w:val="24"/>
+          <w:szCs w:val="24"/>
+        </w:rPr>
+        <w:t>Associations between indel signatures and SBS signatures</w:t>
       </w:r>
     </w:p>
     <w:p>
@@ -2516,17 +2410,31 @@
       </w:r>
       <w:r>
         <w:rPr/>
-        <w:t xml:space="preserve"> signature activities we derived and SBS signature activities</w:t>
-      </w:r>
-      <w:r>
-        <w:rPr>
-          <w:shd w:fill="00FFFF" w:val="clear"/>
-        </w:rPr>
-        <w:t xml:space="preserve"> from &lt;use reference&gt; Degasperi et al</w:t>
-      </w:r>
-      <w:r>
-        <w:rPr/>
-        <w:t>. (</w:t>
+        <w:t xml:space="preserve"> signature activities we derived and SBS signature activitie</w:t>
+      </w:r>
+      <w:r>
+        <w:rPr>
+          <w:shd w:fill="auto" w:val="clear"/>
+        </w:rPr>
+        <w:t xml:space="preserve">s from </w:t>
+      </w:r>
+      <w:bookmarkStart w:id="25" w:name="ZOTERO_BREF_OgOQIXgFsieu_Copy_6"/>
+      <w:r>
+        <w:rPr>
+          <w:shd w:fill="auto" w:val="clear"/>
+        </w:rPr>
+        <w:t>(Degasperi et al. 2022b)</w:t>
+      </w:r>
+      <w:bookmarkEnd w:id="25"/>
+      <w:r>
+        <w:rPr>
+          <w:shd w:fill="auto" w:val="clear"/>
+        </w:rPr>
+        <w:t xml:space="preserve"> </w:t>
+      </w:r>
+      <w:r>
+        <w:rPr/>
+        <w:t>(</w:t>
       </w:r>
       <w:r>
         <w:rPr>
@@ -2557,27 +2465,7 @@
       </w:r>
       <w:r>
         <w:rPr/>
-        <w:t xml:space="preserve">). Using unsupervised hierarchical clustering, we grouped mutational signatures into several distinct modules </w:t>
-      </w:r>
-      <w:r>
-        <w:rPr>
-          <w:shd w:fill="00FFFF" w:val="clear"/>
-        </w:rPr>
-        <w:t>(Figure 5)</w:t>
-      </w:r>
-      <w:r>
-        <w:rPr/>
-        <w:t>. The APOBEC-related cluster includes SBS2 and SBS13 and sho</w:t>
-      </w:r>
-      <w:r>
-        <w:rPr>
-          <w:rFonts w:eastAsia="宋体" w:hint="eastAsia"/>
-        </w:rPr>
-        <w:t>wed</w:t>
-      </w:r>
-      <w:r>
-        <w:rPr/>
-        <w:t xml:space="preserve"> moderate correlations with ID_A and InsDel_Aβ. The homologous recombination deficiency (dHR) cluster, consisting of SBS3 and SBS8, was strongly associated with InsDel6 and InsDel9 (Figure 5, “HR defects”). UV-related signatures, such as SBS7a, SBS38, InsDel13, and InsDel_H, also clustered together, reflecting their shared etiology. The cluster related to POLE proofreading mutations was defined by the strong links between InsDel1b, InsDel_K, and SBS10a. Additional analysis of tumor somatic mutations confirmed that these signatures are associated with dysfunctional POLE proofreading and/or mismatch repair (see Table POLE/mmr checking).</w:t>
+        <w:t xml:space="preserve">). Using unsupervised hierarchical clustering, we grouped mutational signatures into several distinct clusters. </w:t>
       </w:r>
     </w:p>
     <w:p>
@@ -2587,7 +2475,43 @@
       </w:pPr>
       <w:r>
         <w:rPr/>
-        <w:t>Within the mismatch repair deficiency (MMR) cluster, we observed a strong network of correlations between SBS6, SBS26, SBS44, and a group of indel signatures, including C_ID2, InsDel2b, InsDel2c, InsDel7, InsDel_D, and InsDel_J (Figure 5, “MMR defects”). Another notable group, the “Liver” cluster, included InsDel_B, InsDel5a, and InsDel5b. These signatures, which exhibit clock-like mutational behavior, correlated strongly with SBS12 and SBS16. Both SBS12 and SBS16 are commonly found in liver tumors, suggesting these indel signatures highlight a specific clock-like process relevant to hepatocellular carcinogenesis.</w:t>
+        <w:t xml:space="preserve">Some of these cluster provide insight into the possible origins of previously uncharacterized SBS signatures. For example, as seen in in the top left of </w:t>
+      </w:r>
+      <w:r>
+        <w:rPr>
+          <w:shd w:fill="00FFFF" w:val="clear"/>
+        </w:rPr>
+        <w:t xml:space="preserve">Figure 5, </w:t>
+      </w:r>
+      <w:r>
+        <w:rPr/>
+        <w:t xml:space="preserve">SBS92 and SBS4 shared strong associations with C_ID3 and InsDel3b, further supporting a link to tobacco smoking </w:t>
+      </w:r>
+      <w:bookmarkStart w:id="26" w:name="ZOTERO_BREF_CPZ70iBX2EsI"/>
+      <w:r>
+        <w:rPr/>
+        <w:t>(Lawson et al. 2020)</w:t>
+      </w:r>
+      <w:bookmarkEnd w:id="26"/>
+      <w:r>
+        <w:rPr/>
+        <w:t xml:space="preserve">. Near the top right of Figure 5, a cluster labeled “GI-ROS” (gastro-intestinal reactive oxygen species) includes SBS signatures common in gastrointestinal tumors (SBS88, SBS93, SBS17, SBS1 and SBS18) that were strongly correlated with indel signatures InsDel14, C_ID18, InsDel18, ID_N, and InsDel_Nβ. SBS93, in particular, showed a strong transcriptional strand bias, suggesting its association with specific DNA adducts in the GI tract and a possible connection to C_ID14/InsDel14 </w:t>
+      </w:r>
+      <w:r>
+        <w:rPr>
+          <w:shd w:fill="FFFF00" w:val="clear"/>
+        </w:rPr>
+        <w:t>&lt;Is there any connection besides correlation?&gt;</w:t>
+      </w:r>
+      <w:r>
+        <w:rPr/>
+        <w:t>. Meanwhile, C_ID1 and InsDel1a exhibited stronger correlations with SBS1 and SBS18, supporting their association with mutagenesis driven by reactive oxygen species</w:t>
+      </w:r>
+      <w:r>
+        <w:rPr>
+          <w:shd w:fill="FFFF00" w:val="clear"/>
+        </w:rPr>
+        <w:t xml:space="preserve"> &lt;SBS1 is not usually thought of as ROS related and we already called this GI-ROS – only because of SBS18&gt; . </w:t>
       </w:r>
     </w:p>
     <w:p>
@@ -2597,7 +2521,17 @@
       </w:pPr>
       <w:r>
         <w:rPr/>
-        <w:t>The 89-type taxonomy also allowed us to better resolve the relationships within previously broader categories. For instance, the three signatures derived from C_ID1 (InsDel1a, InsDel1b, and InsDel1c) each showed distinct correlation patterns. InsDel1a closely recapitulated the correlation profile of the original C_ID1, and frequently co-occurred with SBS88, SBS17, and SBS93, which are prominent in the “GI-ROS” cluster associated with gastrointestinal and reactive oxygen species-related mutagenesis. In contrast, InsDel1b was linked to POLE proofreading errors, while InsDel1c was more frequently associated with liver cancer signatures.</w:t>
+        <w:t>This detected the APOBEC-related cluster includes SBS2 and SBS13 and sho</w:t>
+      </w:r>
+      <w:r>
+        <w:rPr>
+          <w:rFonts w:eastAsia="宋体" w:hint="eastAsia"/>
+        </w:rPr>
+        <w:t>wed</w:t>
+      </w:r>
+      <w:r>
+        <w:rPr/>
+        <w:t xml:space="preserve"> moderate correlations with ID_A and InsDel_Aβ. The homologous recombination deficiency (dHR) cluster, consisting of SBS3 and SBS8, was strongly associated with InsDel6 and InsDel9 (Figure 5, “HR defects”). UV-related signatures, such as SBS7a, SBS38, InsDel13, and InsDel_H, also clustered together, reflecting their shared etiology. The cluster related to POLE proofreading mutations was defined by the strong links between InsDel1b, InsDel_K, and SBS10a. Additional analysis of tumor somatic mutations confirmed that these signatures are associated with dysfunctional POLE proofreading and/or mismatch repair (see Table POLE/mmr checking).</w:t>
       </w:r>
     </w:p>
     <w:p>
@@ -2607,19 +2541,17 @@
       </w:pPr>
       <w:r>
         <w:rPr/>
-        <w:t xml:space="preserve">These correlation patterns provide insight into the possible origins of previously uncharacterized SBS signatures. For example, SBS92 closely mirrored the correlation profile of SBS4, largely through its strong associations with C_ID3 and InsDel3b, pointing toward a potential link with tobacco smoking (Figure 5, “Lung Tobacco Smoking”). In the GI-ROS cluster, which includes signatures common in gastrointestinal tumors (SBS17, SBS18, SBS1, SBS88, and SBS93), we observed that C_ID18/InsDel18, ID_N, and InsDel_Nβ were more tightly linked to signatures typically seen in the GI tract. SBS93, in particular, shows a strong transcriptional strand bias, suggesting its association with specific DNA adducts in the GI tract and a possible connection to C_ID14/InsDel14. Meanwhile, C_ID1 and InsDel1a exhibited stronger correlations with SBS1 and SBS18, supporting their association with mutagenesis driven by reactive oxygen species (Figure 5, “GI-ROS”). </w:t>
+        <w:t>Within the mismatch repair deficiency (MMR) cluster, we observed a strong network of correlations between SBS6, SBS26, SBS44, and a group of indel signatures, including C_ID2, InsDel2b, InsDel2c, InsDel7, InsDel_D, and InsDel_J (Figure 5, “MMR defects”). Another notable group, the “Liver” cluster, included InsDel_B, InsDel5a, and InsDel5b. These signatures, which exhibit clock-like mutational behavior, correlated strongly with SBS12 and SBS16. Both SBS12 and SBS16 are commonly found in liver tumors, suggesting these indel signatures highlight a specific clock-like process relevant to hepatocellular carcinogenesis.</w:t>
       </w:r>
     </w:p>
     <w:p>
       <w:pPr>
-        <w:pStyle w:val="Heading2"/>
-        <w:rPr/>
-      </w:pPr>
-      <w:r>
-        <w:rPr>
-          <w:rFonts w:hint="eastAsia"/>
-        </w:rPr>
-        <w:t>Topography of indel mutational signatures &lt;MO EDIT&gt;</w:t>
+        <w:pStyle w:val="Normal"/>
+        <w:rPr/>
+      </w:pPr>
+      <w:r>
+        <w:rPr/>
+        <w:t>The 89-type taxonomy also allowed us to better resolve the relationships within previously broader categories. For instance, the three signatures derived from C_ID1 (InsDel1a, InsDel1b, and InsDel1c) each showed distinct correlation patterns. InsDel1a closely recapitulated the correlation profile of the original C_ID1, and frequently co-occurred with SBS88, SBS17, and SBS93, which are prominent in the “GI-ROS” cluster associated with gastrointestinal and reactive oxygen species-related mutagenesis. In contrast, InsDel1b was linked to POLE proofreading errors, while InsDel1c was more frequently associated with liver cancer signatures.</w:t>
       </w:r>
     </w:p>
     <w:p>
@@ -2629,11 +2561,32 @@
       </w:pPr>
       <w:r>
         <w:rPr/>
-        <w:t>Interesting – ID_K lagging strand enrichment related to POLE</w:t>
       </w:r>
     </w:p>
     <w:p>
       <w:pPr>
+        <w:pStyle w:val="Heading2"/>
+        <w:rPr/>
+      </w:pPr>
+      <w:r>
+        <w:rPr>
+          <w:rFonts w:hint="eastAsia"/>
+        </w:rPr>
+        <w:t>Topography of indel mutational signatures &lt;MO EDIT&gt;</w:t>
+      </w:r>
+    </w:p>
+    <w:p>
+      <w:pPr>
+        <w:pStyle w:val="Normal"/>
+        <w:rPr/>
+      </w:pPr>
+      <w:r>
+        <w:rPr/>
+        <w:t>Interesting – ID_K lagging strand enrichment related to POLE</w:t>
+      </w:r>
+    </w:p>
+    <w:p>
+      <w:pPr>
         <w:pStyle w:val="Normal"/>
         <w:rPr/>
       </w:pPr>
@@ -3165,12 +3118,12 @@
         <w:rPr/>
         <w:t xml:space="preserve">Cells with RNase H2 deficiency cannot efficiently remove ribonucleotides that had previously been incorporated into genomic DNA, and this sets the stage for topoisomerase-1 (TOP1) associated mutagenesis. This was previously proposed to generate indel signature ID4 </w:t>
       </w:r>
-      <w:bookmarkStart w:id="19" w:name="ZOTERO_BREF_xeDB1zkV4c3y"/>
+      <w:bookmarkStart w:id="27" w:name="ZOTERO_BREF_xeDB1zkV4c3y"/>
       <w:r>
         <w:rPr/>
         <w:t>(Jin et al. 2024; Reijns et al. 2022; Koh et al. 2025)</w:t>
       </w:r>
-      <w:bookmarkEnd w:id="19"/>
+      <w:bookmarkEnd w:id="27"/>
       <w:r>
         <w:rPr/>
         <w:t xml:space="preserve">. However, we detected a new indel signature, InsDel_F, which better corresponds to RNase H2 deficiency experimental data than ID4 </w:t>
@@ -3576,9 +3529,9 @@
         </w:rPr>
         <w:t xml:space="preserve">We also investigated the genome-wide topographical features associated with indel signatures, including transcriptional strand bias, replication strand bias, genic distribution, and replication timing. </w:t>
       </w:r>
+      <w:commentRangeStart w:id="0"/>
       <w:commentRangeStart w:id="1"/>
       <w:commentRangeStart w:id="2"/>
-      <w:commentRangeStart w:id="3"/>
       <w:r>
         <w:rPr>
           <w:rFonts w:eastAsia="宋体" w:eastAsiaTheme="minorEastAsia"/>
@@ -3590,27 +3543,27 @@
           <w:rFonts w:eastAsia="宋体" w:eastAsiaTheme="minorEastAsia"/>
         </w:rPr>
       </w:r>
-      <w:commentRangeEnd w:id="3"/>
-      <w:r>
-        <w:commentReference w:id="3"/>
+      <w:commentRangeEnd w:id="2"/>
+      <w:r>
+        <w:commentReference w:id="2"/>
       </w:r>
       <w:r>
         <w:rPr>
           <w:rFonts w:eastAsia="宋体" w:eastAsiaTheme="minorEastAsia"/>
         </w:rPr>
       </w:r>
-      <w:commentRangeEnd w:id="2"/>
-      <w:r>
-        <w:commentReference w:id="2"/>
+      <w:commentRangeEnd w:id="1"/>
+      <w:r>
+        <w:commentReference w:id="1"/>
       </w:r>
       <w:r>
         <w:rPr>
           <w:rFonts w:eastAsia="宋体" w:eastAsiaTheme="minorEastAsia"/>
         </w:rPr>
       </w:r>
-      <w:commentRangeEnd w:id="1"/>
-      <w:r>
-        <w:commentReference w:id="1"/>
+      <w:commentRangeEnd w:id="0"/>
+      <w:r>
+        <w:commentReference w:id="0"/>
       </w:r>
       <w:r>
         <w:rPr>
@@ -3760,15 +3713,7 @@
       </w:r>
       <w:r>
         <w:rPr/>
-        <w:t xml:space="preserve"> </w:t>
-      </w:r>
-      <w:r>
-        <w:rPr/>
-        <w:t xml:space="preserve">are available </w:t>
-      </w:r>
-      <w:r>
-        <w:rPr/>
-        <w:t>in Table S</w:t>
+        <w:t xml:space="preserve"> are available in Table S</w:t>
       </w:r>
       <w:r>
         <w:rPr>
@@ -3788,14 +3733,14 @@
         </w:rPr>
         <w:t xml:space="preserve"> in </w:t>
       </w:r>
-      <w:bookmarkStart w:id="20" w:name="ZOTERO_BREF_Jmprd6S6YeS8"/>
+      <w:bookmarkStart w:id="28" w:name="ZOTERO_BREF_Jmprd6S6YeS8"/>
       <w:r>
         <w:rPr>
           <w:rFonts w:hint="eastAsia"/>
         </w:rPr>
         <w:t>(Priestley et al. 2019)</w:t>
       </w:r>
-      <w:bookmarkEnd w:id="20"/>
+      <w:bookmarkEnd w:id="28"/>
       <w:r>
         <w:rPr/>
         <w:t xml:space="preserve">. </w:t>
@@ -5545,7 +5490,7 @@
         <w:pStyle w:val="Bibliography1"/>
         <w:rPr/>
       </w:pPr>
-      <w:bookmarkStart w:id="21" w:name="ZOTERO_BREF_LiVs887hgA47"/>
+      <w:bookmarkStart w:id="29" w:name="ZOTERO_BREF_LiVs887hgA47"/>
       <w:r>
         <w:rPr/>
         <w:t xml:space="preserve">Alexandrov, Ludmil B., Young Seok Ju, Kerstin Haase, et al. 2016. ‘Mutational Signatures Associated with Tobacco Smoking in Human Cancer’. </w:t>
@@ -5728,7 +5673,7 @@
       </w:pPr>
       <w:r>
         <w:rPr/>
-        <w:t xml:space="preserve">Degasperi, Andrea, Xueqing Zou, Tauanne Dias Amarante, et al. 2022. ‘Substitution Mutational Signatures in Whole-Genome–Sequenced Cancers in the UK Population’. </w:t>
+        <w:t xml:space="preserve">Degasperi, Andrea, Xueqing Zou, Tauanne Dias Amarante, et al. 2022a. ‘Substitution Mutational Signatures in Whole-Genome–Sequenced Cancers in the UK Population’. </w:t>
       </w:r>
       <w:r>
         <w:rPr>
@@ -5748,17 +5693,17 @@
       </w:pPr>
       <w:r>
         <w:rPr/>
-        <w:t xml:space="preserve">DeWeerd, Rachel A., Eszter Németh, Ádám Póti, et al. 2022. ‘Prospectively Defined Patterns of APOBEC3A Mutagenesis Are Prevalent in Human Cancers’. </w:t>
+        <w:t xml:space="preserve">Degasperi, Andrea, Xueqing Zou, Tauanne Dias Amarante, et al. 2022b. ‘Substitution Mutational Signatures in Whole-Genome–Sequenced Cancers in the UK Population’. </w:t>
       </w:r>
       <w:r>
         <w:rPr>
           <w:i/>
         </w:rPr>
-        <w:t>Cell Reports</w:t>
-      </w:r>
-      <w:r>
-        <w:rPr/>
-        <w:t xml:space="preserve"> 38 (12): 110555. https://doi.org/10.1016/j.celrep.2022.110555.</w:t>
+        <w:t>Science</w:t>
+      </w:r>
+      <w:r>
+        <w:rPr/>
+        <w:t xml:space="preserve"> 376 (6591). https://doi.org/10.1126/science.abl9283.</w:t>
       </w:r>
     </w:p>
     <w:p>
@@ -5768,17 +5713,17 @@
       </w:pPr>
       <w:r>
         <w:rPr/>
-        <w:t xml:space="preserve">Dziubańska-Kusibab, Paulina J., Hilmar Berger, Federica Battistini, et al. 2020. ‘Colibactin DNA-Damage Signature Indicates Mutational Impact in Colorectal Cancer’. </w:t>
+        <w:t xml:space="preserve">DeWeerd, Rachel A., Eszter Németh, Ádám Póti, et al. 2022. ‘Prospectively Defined Patterns of APOBEC3A Mutagenesis Are Prevalent in Human Cancers’. </w:t>
       </w:r>
       <w:r>
         <w:rPr>
           <w:i/>
         </w:rPr>
-        <w:t>Nature Medicine</w:t>
-      </w:r>
-      <w:r>
-        <w:rPr/>
-        <w:t xml:space="preserve"> 26 (7): 1063–69. https://doi.org/10.1038/s41591-020-0908-2.</w:t>
+        <w:t>Cell Reports</w:t>
+      </w:r>
+      <w:r>
+        <w:rPr/>
+        <w:t xml:space="preserve"> 38 (12): 110555. https://doi.org/10.1016/j.celrep.2022.110555.</w:t>
       </w:r>
     </w:p>
     <w:p>
@@ -5788,17 +5733,17 @@
       </w:pPr>
       <w:r>
         <w:rPr/>
-        <w:t xml:space="preserve">Hoang, Margaret L., Chung-Hsin Chen, Viktoriya S. Sidorenko, et al. 2013. ‘Mutational Signature of Aristolochic Acid Exposure as Revealed by Whole-Exome Sequencing’. </w:t>
+        <w:t xml:space="preserve">Dziubańska-Kusibab, Paulina J., Hilmar Berger, Federica Battistini, et al. 2020. ‘Colibactin DNA-Damage Signature Indicates Mutational Impact in Colorectal Cancer’. </w:t>
       </w:r>
       <w:r>
         <w:rPr>
           <w:i/>
         </w:rPr>
-        <w:t>Science Translational Medicine</w:t>
-      </w:r>
-      <w:r>
-        <w:rPr/>
-        <w:t xml:space="preserve"> 5 (197). https://doi.org/10.1126/scitranslmed.3006200.</w:t>
+        <w:t>Nature Medicine</w:t>
+      </w:r>
+      <w:r>
+        <w:rPr/>
+        <w:t xml:space="preserve"> 26 (7): 1063–69. https://doi.org/10.1038/s41591-020-0908-2.</w:t>
       </w:r>
     </w:p>
     <w:p>
@@ -5808,17 +5753,17 @@
       </w:pPr>
       <w:r>
         <w:rPr/>
-        <w:t xml:space="preserve">Huang, Mi Ni, Willie Yu, Wei Wei Teoh, et al. 2017. ‘Genome-Scale Mutational Signatures of Aflatoxin in Cells, Mice, and Human Tumors’. </w:t>
+        <w:t xml:space="preserve">Hoang, Margaret L., Chung-Hsin Chen, Viktoriya S. Sidorenko, et al. 2013. ‘Mutational Signature of Aristolochic Acid Exposure as Revealed by Whole-Exome Sequencing’. </w:t>
       </w:r>
       <w:r>
         <w:rPr>
           <w:i/>
         </w:rPr>
-        <w:t>Genome Research</w:t>
-      </w:r>
-      <w:r>
-        <w:rPr/>
-        <w:t xml:space="preserve"> 27 (9): 1475–86. https://doi.org/10.1101/gr.220038.116.</w:t>
+        <w:t>Science Translational Medicine</w:t>
+      </w:r>
+      <w:r>
+        <w:rPr/>
+        <w:t xml:space="preserve"> 5 (197). https://doi.org/10.1126/scitranslmed.3006200.</w:t>
       </w:r>
     </w:p>
     <w:p>
@@ -5828,17 +5773,17 @@
       </w:pPr>
       <w:r>
         <w:rPr/>
-        <w:t xml:space="preserve">Huang, Mini, John R. McPherson, Ioana Cutcutache, Bin Tean Teh, Patrick Tan, and Steven G. Rozen. 2015. ‘MSIseq: Software for Assessing Microsatellite Instability from Catalogs of Somatic Mutations’. </w:t>
+        <w:t xml:space="preserve">Huang, Mi Ni, Willie Yu, Wei Wei Teoh, et al. 2017. ‘Genome-Scale Mutational Signatures of Aflatoxin in Cells, Mice, and Human Tumors’. </w:t>
       </w:r>
       <w:r>
         <w:rPr>
           <w:i/>
         </w:rPr>
-        <w:t>Scientific Reports</w:t>
-      </w:r>
-      <w:r>
-        <w:rPr/>
-        <w:t xml:space="preserve"> 5 (1): 13321. https://doi.org/10.1038/srep13321.</w:t>
+        <w:t>Genome Research</w:t>
+      </w:r>
+      <w:r>
+        <w:rPr/>
+        <w:t xml:space="preserve"> 27 (9): 1475–86. https://doi.org/10.1101/gr.220038.116.</w:t>
       </w:r>
     </w:p>
     <w:p>
@@ -5848,17 +5793,17 @@
       </w:pPr>
       <w:r>
         <w:rPr/>
-        <w:t xml:space="preserve">Islam, S. M. Ashiqul, Marcos Díaz-Gay, Yang Wu, et al. 2022. ‘Uncovering Novel Mutational Signatures by de Novo Extraction with SigProfilerExtractor’. </w:t>
+        <w:t xml:space="preserve">Huang, Mini, John R. McPherson, Ioana Cutcutache, Bin Tean Teh, Patrick Tan, and Steven G. Rozen. 2015. ‘MSIseq: Software for Assessing Microsatellite Instability from Catalogs of Somatic Mutations’. </w:t>
       </w:r>
       <w:r>
         <w:rPr>
           <w:i/>
         </w:rPr>
-        <w:t>Cell Genomics</w:t>
-      </w:r>
-      <w:r>
-        <w:rPr/>
-        <w:t xml:space="preserve"> 2 (11). https://doi.org/10.1016/j.xgen.2022.100179.</w:t>
+        <w:t>Scientific Reports</w:t>
+      </w:r>
+      <w:r>
+        <w:rPr/>
+        <w:t xml:space="preserve"> 5 (1): 13321. https://doi.org/10.1038/srep13321.</w:t>
       </w:r>
     </w:p>
     <w:p>
@@ -5868,17 +5813,17 @@
       </w:pPr>
       <w:r>
         <w:rPr/>
-        <w:t xml:space="preserve">Jin, Hu, Doga C. Gulhan, Benedikt Geiger, et al. 2024. ‘Accurate and Sensitive Mutational Signature Analysis with MuSiCal’. </w:t>
+        <w:t xml:space="preserve">Islam, S. M. Ashiqul, Marcos Díaz-Gay, Yang Wu, et al. 2022. ‘Uncovering Novel Mutational Signatures by de Novo Extraction with SigProfilerExtractor’. </w:t>
       </w:r>
       <w:r>
         <w:rPr>
           <w:i/>
         </w:rPr>
-        <w:t>Nature Genetics</w:t>
-      </w:r>
-      <w:r>
-        <w:rPr/>
-        <w:t xml:space="preserve"> 56 (3): 541–52. https://doi.org/10.1038/s41588-024-01659-0.</w:t>
+        <w:t>Cell Genomics</w:t>
+      </w:r>
+      <w:r>
+        <w:rPr/>
+        <w:t xml:space="preserve"> 2 (11). https://doi.org/10.1016/j.xgen.2022.100179.</w:t>
       </w:r>
     </w:p>
     <w:p>
@@ -5888,7 +5833,7 @@
       </w:pPr>
       <w:r>
         <w:rPr/>
-        <w:t xml:space="preserve">Koh, Gene Ching Chiek, Arjun Scott Nanda, Giuseppe Rinaldi, et al. 2025. ‘A Redefined InDel Taxonomy Provides Insights into Mutational Signatures’. </w:t>
+        <w:t xml:space="preserve">Jin, Hu, Doga C. Gulhan, Benedikt Geiger, et al. 2024. ‘Accurate and Sensitive Mutational Signature Analysis with MuSiCal’. </w:t>
       </w:r>
       <w:r>
         <w:rPr>
@@ -5898,7 +5843,7 @@
       </w:r>
       <w:r>
         <w:rPr/>
-        <w:t>, ahead of print, April 10. https://doi.org/10.1038/s41588-025-02152-y.</w:t>
+        <w:t xml:space="preserve"> 56 (3): 541–52. https://doi.org/10.1038/s41588-024-01659-0.</w:t>
       </w:r>
     </w:p>
     <w:p>
@@ -5908,17 +5853,17 @@
       </w:pPr>
       <w:r>
         <w:rPr/>
-        <w:t xml:space="preserve">Kucab, Jill E., Xueqing Zou, Sandro Morganella, et al. 2019. ‘A Compendium of Mutational Signatures of Environmental Agents’. </w:t>
+        <w:t xml:space="preserve">Koh, Gene Ching Chiek, Arjun Scott Nanda, Giuseppe Rinaldi, et al. 2025. ‘A Redefined InDel Taxonomy Provides Insights into Mutational Signatures’. </w:t>
       </w:r>
       <w:r>
         <w:rPr>
           <w:i/>
         </w:rPr>
-        <w:t>Cell</w:t>
-      </w:r>
-      <w:r>
-        <w:rPr/>
-        <w:t xml:space="preserve"> 177 (4): 821-836.e16. https://doi.org/10.1016/j.cell.2019.03.001.</w:t>
+        <w:t>Nature Genetics</w:t>
+      </w:r>
+      <w:r>
+        <w:rPr/>
+        <w:t>, ahead of print, April 10. https://doi.org/10.1038/s41588-025-02152-y.</w:t>
       </w:r>
     </w:p>
     <w:p>
@@ -5928,17 +5873,17 @@
       </w:pPr>
       <w:r>
         <w:rPr/>
-        <w:t xml:space="preserve">Liu, Mo, Yang Wu, Nanhai Jiang, Arnoud Boot, and Steven G. Rozen. 2023. ‘mSigHdp: Hierarchical Dirichlet Process Mixture Modeling for Mutational Signature Discovery’. </w:t>
+        <w:t xml:space="preserve">Kucab, Jill E., Xueqing Zou, Sandro Morganella, et al. 2019. ‘A Compendium of Mutational Signatures of Environmental Agents’. </w:t>
       </w:r>
       <w:r>
         <w:rPr>
           <w:i/>
         </w:rPr>
-        <w:t>NAR Genomics and Bioinformatics</w:t>
-      </w:r>
-      <w:r>
-        <w:rPr/>
-        <w:t xml:space="preserve"> 5 (1): lqad005. https://doi.org/10.1093/nargab/lqad005.</w:t>
+        <w:t>Cell</w:t>
+      </w:r>
+      <w:r>
+        <w:rPr/>
+        <w:t xml:space="preserve"> 177 (4): 821-836.e16. https://doi.org/10.1016/j.cell.2019.03.001.</w:t>
       </w:r>
     </w:p>
     <w:p>
@@ -5948,17 +5893,17 @@
       </w:pPr>
       <w:r>
         <w:rPr/>
-        <w:t xml:space="preserve">Ng, Alvin W. T., Song Ling Poon, Mi Ni Huang, et al. 2017. </w:t>
+        <w:t xml:space="preserve">Lawson, Andrew R. J., Federico Abascal, Tim H. H. Coorens, et al. 2020. ‘Extensive Heterogeneity in Somatic Mutation and Selection in the Human Bladder’. </w:t>
       </w:r>
       <w:r>
         <w:rPr>
           <w:i/>
         </w:rPr>
-        <w:t>Aristolochic Acids and Their Derivatives Are Widely Implicated in Liver Cancers in Taiwan and throughout Asia</w:t>
-      </w:r>
-      <w:r>
-        <w:rPr/>
-        <w:t>. https://www.science.org.</w:t>
+        <w:t>Science</w:t>
+      </w:r>
+      <w:r>
+        <w:rPr/>
+        <w:t xml:space="preserve"> 370 (6512): 75–82. https://doi.org/10.1126/science.aba8347.</w:t>
       </w:r>
     </w:p>
     <w:p>
@@ -5968,17 +5913,17 @@
       </w:pPr>
       <w:r>
         <w:rPr/>
-        <w:t xml:space="preserve">Nik-Zainal, Serena, Ludmil B. Alexandrov, David C. Wedge, et al. 2012. ‘Mutational Processes Molding the Genomes of 21 Breast Cancers’. </w:t>
+        <w:t xml:space="preserve">Liu, Mo, Yang Wu, Nanhai Jiang, Arnoud Boot, and Steven G. Rozen. 2023. ‘mSigHdp: Hierarchical Dirichlet Process Mixture Modeling for Mutational Signature Discovery’. </w:t>
       </w:r>
       <w:r>
         <w:rPr>
           <w:i/>
         </w:rPr>
-        <w:t>Cell</w:t>
-      </w:r>
-      <w:r>
-        <w:rPr/>
-        <w:t xml:space="preserve"> 149 (5): 979–93. https://doi.org/10.1016/j.cell.2012.04.024.</w:t>
+        <w:t>NAR Genomics and Bioinformatics</w:t>
+      </w:r>
+      <w:r>
+        <w:rPr/>
+        <w:t xml:space="preserve"> 5 (1): lqad005. https://doi.org/10.1093/nargab/lqad005.</w:t>
       </w:r>
     </w:p>
     <w:p>
@@ -5988,17 +5933,17 @@
       </w:pPr>
       <w:r>
         <w:rPr/>
-        <w:t xml:space="preserve">Poon, Song Ling, Mi Ni Huang, Yang Choo, et al. 2015. ‘Mutation Signatures Implicate Aristolochic Acid in Bladder Cancer Development’. </w:t>
+        <w:t xml:space="preserve">Ng, Alvin W. T., Song Ling Poon, Mi Ni Huang, et al. 2017. </w:t>
       </w:r>
       <w:r>
         <w:rPr>
           <w:i/>
         </w:rPr>
-        <w:t>Genome Medicine</w:t>
-      </w:r>
-      <w:r>
-        <w:rPr/>
-        <w:t xml:space="preserve"> 7 (1): 38. https://doi.org/10.1186/s13073-015-0161-3.</w:t>
+        <w:t>Aristolochic Acids and Their Derivatives Are Widely Implicated in Liver Cancers in Taiwan and throughout Asia</w:t>
+      </w:r>
+      <w:r>
+        <w:rPr/>
+        <w:t>. https://www.science.org.</w:t>
       </w:r>
     </w:p>
     <w:p>
@@ -6008,17 +5953,17 @@
       </w:pPr>
       <w:r>
         <w:rPr/>
-        <w:t xml:space="preserve">Poon, Song Ling, See-Tong Pang, John R. McPherson, et al. 2013. ‘Genome-Wide Mutational Signatures of Aristolochic Acid and Its Application as a Screening Tool’. </w:t>
+        <w:t xml:space="preserve">Nik-Zainal, Serena, Ludmil B. Alexandrov, David C. Wedge, et al. 2012. ‘Mutational Processes Molding the Genomes of 21 Breast Cancers’. </w:t>
       </w:r>
       <w:r>
         <w:rPr>
           <w:i/>
         </w:rPr>
-        <w:t>Science Translational Medicine</w:t>
-      </w:r>
-      <w:r>
-        <w:rPr/>
-        <w:t xml:space="preserve"> 5 (197). https://doi.org/10.1126/scitranslmed.3006086.</w:t>
+        <w:t>Cell</w:t>
+      </w:r>
+      <w:r>
+        <w:rPr/>
+        <w:t xml:space="preserve"> 149 (5): 979–93. https://doi.org/10.1016/j.cell.2012.04.024.</w:t>
       </w:r>
     </w:p>
     <w:p>
@@ -6028,17 +5973,17 @@
       </w:pPr>
       <w:r>
         <w:rPr/>
-        <w:t xml:space="preserve">Priestley, Peter, Jonathan Baber, Martijn P. Lolkema, et al. 2019. ‘Pan-Cancer Whole-Genome Analyses of Metastatic Solid Tumours’. </w:t>
+        <w:t xml:space="preserve">Poon, Song Ling, Mi Ni Huang, Yang Choo, et al. 2015. ‘Mutation Signatures Implicate Aristolochic Acid in Bladder Cancer Development’. </w:t>
       </w:r>
       <w:r>
         <w:rPr>
           <w:i/>
         </w:rPr>
-        <w:t>Nature</w:t>
-      </w:r>
-      <w:r>
-        <w:rPr/>
-        <w:t xml:space="preserve"> 575 (7781): 210–16. https://doi.org/10.1038/s41586-019-1689-y.</w:t>
+        <w:t>Genome Medicine</w:t>
+      </w:r>
+      <w:r>
+        <w:rPr/>
+        <w:t xml:space="preserve"> 7 (1): 38. https://doi.org/10.1186/s13073-015-0161-3.</w:t>
       </w:r>
     </w:p>
     <w:p>
@@ -6048,17 +5993,17 @@
       </w:pPr>
       <w:r>
         <w:rPr/>
-        <w:t xml:space="preserve">Reijns, Martin A. M., David A. Parry, Thomas C. Williams, et al. 2022. ‘Signatures of TOP1 Transcription-Associated Mutagenesis in Cancer and Germline’. </w:t>
+        <w:t xml:space="preserve">Poon, Song Ling, See-Tong Pang, John R. McPherson, et al. 2013. ‘Genome-Wide Mutational Signatures of Aristolochic Acid and Its Application as a Screening Tool’. </w:t>
       </w:r>
       <w:r>
         <w:rPr>
           <w:i/>
         </w:rPr>
-        <w:t>Nature</w:t>
-      </w:r>
-      <w:r>
-        <w:rPr/>
-        <w:t xml:space="preserve"> 602 (7898): 623–31. https://doi.org/10.1038/s41586-022-04403-y.</w:t>
+        <w:t>Science Translational Medicine</w:t>
+      </w:r>
+      <w:r>
+        <w:rPr/>
+        <w:t xml:space="preserve"> 5 (197). https://doi.org/10.1126/scitranslmed.3006086.</w:t>
       </w:r>
     </w:p>
     <w:p>
@@ -6068,6 +6013,46 @@
       </w:pPr>
       <w:r>
         <w:rPr/>
+        <w:t xml:space="preserve">Priestley, Peter, Jonathan Baber, Martijn P. Lolkema, et al. 2019. ‘Pan-Cancer Whole-Genome Analyses of Metastatic Solid Tumours’. </w:t>
+      </w:r>
+      <w:r>
+        <w:rPr>
+          <w:i/>
+        </w:rPr>
+        <w:t>Nature</w:t>
+      </w:r>
+      <w:r>
+        <w:rPr/>
+        <w:t xml:space="preserve"> 575 (7781): 210–16. https://doi.org/10.1038/s41586-019-1689-y.</w:t>
+      </w:r>
+    </w:p>
+    <w:p>
+      <w:pPr>
+        <w:pStyle w:val="Bibliography1"/>
+        <w:rPr/>
+      </w:pPr>
+      <w:r>
+        <w:rPr/>
+        <w:t xml:space="preserve">Reijns, Martin A. M., David A. Parry, Thomas C. Williams, et al. 2022. ‘Signatures of TOP1 Transcription-Associated Mutagenesis in Cancer and Germline’. </w:t>
+      </w:r>
+      <w:r>
+        <w:rPr>
+          <w:i/>
+        </w:rPr>
+        <w:t>Nature</w:t>
+      </w:r>
+      <w:r>
+        <w:rPr/>
+        <w:t xml:space="preserve"> 602 (7898): 623–31. https://doi.org/10.1038/s41586-022-04403-y.</w:t>
+      </w:r>
+    </w:p>
+    <w:p>
+      <w:pPr>
+        <w:pStyle w:val="Bibliography1"/>
+        <w:rPr/>
+      </w:pPr>
+      <w:r>
+        <w:rPr/>
         <w:t xml:space="preserve">Riva, Laura, Arun R. Pandiri, Yun Rose Li, et al. 2020. ‘The Mutational Signature Profile of Known and Suspected Human Carcinogens in Mice’. </w:t>
       </w:r>
       <w:r>
@@ -6080,7 +6065,7 @@
         <w:rPr/>
         <w:t xml:space="preserve"> 52 (11): 1189–97. https://doi.org/10.1038/s41588-020-0692-4.</w:t>
       </w:r>
-      <w:bookmarkEnd w:id="21"/>
+      <w:bookmarkEnd w:id="29"/>
     </w:p>
     <w:p>
       <w:pPr>
@@ -21420,7 +21405,7 @@
 
 <file path=word/comments.xml><?xml version="1.0" encoding="utf-8"?>
 <w:comments xmlns:o="urn:schemas-microsoft-com:office:office" xmlns:r="http://schemas.openxmlformats.org/officeDocument/2006/relationships" xmlns:v="urn:schemas-microsoft-com:vml" xmlns:w="http://schemas.openxmlformats.org/wordprocessingml/2006/main" xmlns:w10="urn:schemas-microsoft-com:office:word" xmlns:wp="http://schemas.openxmlformats.org/drawingml/2006/wordprocessingDrawing" xmlns:pic="http://schemas.openxmlformats.org/drawingml/2006/picture" xmlns:wps="http://schemas.microsoft.com/office/word/2010/wordprocessingShape" xmlns:wpg="http://schemas.microsoft.com/office/word/2010/wordprocessingGroup" xmlns:mc="http://schemas.openxmlformats.org/markup-compatibility/2006" xmlns:wp14="http://schemas.microsoft.com/office/word/2010/wordprocessingDrawing" xmlns:w14="http://schemas.microsoft.com/office/word/2010/wordml" xmlns:w15="http://schemas.microsoft.com/office/word/2012/wordml" mc:Ignorable="w14 wp14 w15">
-  <w:comment w:id="0" w:author="Mo Liu" w:date="2026-05-20T09:26:00Z" w:initials="ML">
+  <w:comment w:id="2" w:author="Mo Liu" w:date="2026-05-25T13:45:00Z" w:initials="ML">
     <w:p>
       <w:pPr>
         <w:overflowPunct w:val="true"/>
@@ -21436,11 +21421,11 @@
           <w:sz w:val="22"/>
           <w:szCs w:val="22"/>
         </w:rPr>
-        <w:t>I added cancer type enrichment plot to Figure 5</w:t>
+        <w:t>This is true. But not sure if this worths mentioning?</w:t>
       </w:r>
     </w:p>
   </w:comment>
-  <w:comment w:id="3" w:author="Mo Liu" w:date="2026-05-25T13:45:00Z" w:initials="ML">
+  <w:comment w:id="1" w:author="Steve Rozen, Ph.D." w:date="2026-05-28T17:52:00Z" w:initials="SR">
     <w:p>
       <w:pPr>
         <w:overflowPunct w:val="true"/>
@@ -21456,14 +21441,14 @@
           <w:sz w:val="22"/>
           <w:szCs w:val="22"/>
         </w:rPr>
-        <w:t>This is true. But not sure if this worths mentioning?</w:t>
+        <w:t>Which ones do we supply that COSMIC does not, and are there any discordances between what we get and COSMIC for signatures that COSMIC does have topographical annotations for?</w:t>
       </w:r>
     </w:p>
   </w:comment>
-  <w:comment w:id="2" w:author="Steve Rozen, Ph.D." w:date="2026-05-28T17:52:00Z" w:initials="SR">
+  <w:comment w:id="0" w:author="Mo Liu" w:date="2026-05-29T16:03:00Z" w:initials="ML">
     <w:p>
       <w:pPr>
-        <w:overflowPunct w:val="true"/>
+        <w:overflowPunct w:val="false"/>
         <w:spacing w:lineRule="auto" w:line="240" w:before="0" w:after="0"/>
         <w:rPr/>
       </w:pPr>
@@ -21473,26 +21458,6 @@
       <w:r>
         <w:rPr>
           <w:rFonts w:eastAsia="宋体" w:cs="Noto Sans Arabic UI" w:ascii="Calibri" w:hAnsi="Calibri"/>
-          <w:sz w:val="22"/>
-          <w:szCs w:val="22"/>
-        </w:rPr>
-        <w:t>Which ones do we supply that COSMIC does not, and are there any discordances between what we get and COSMIC for signatures that COSMIC does have topographical annotations for?</w:t>
-      </w:r>
-    </w:p>
-  </w:comment>
-  <w:comment w:id="1" w:author="Mo Liu" w:date="2026-05-29T16:03:00Z" w:initials="ML">
-    <w:p>
-      <w:pPr>
-        <w:overflowPunct w:val="false"/>
-        <w:spacing w:before="0" w:after="0" w:lineRule="auto" w:line="240"/>
-        <w:rPr/>
-      </w:pPr>
-      <w:r>
-        <w:annotationRef/>
-      </w:r>
-      <w:r>
-        <w:rPr>
-          <w:rFonts w:cs="Noto Sans Arabic UI" w:eastAsia="宋体" w:ascii="Calibri" w:hAnsi="Calibri"/>
           <w:sz w:val="22"/>
           <w:szCs w:val="22"/>
         </w:rPr>
@@ -21515,8 +21480,7 @@
   <w:p>
     <w:pPr>
       <w:pStyle w:val="Footer"/>
-      <w:snapToGrid w:val="false"/>
-      <w:spacing w:lineRule="auto" w:line="240" w:before="0" w:after="160"/>
+      <w:spacing w:before="0" w:after="160"/>
       <w:rPr/>
     </w:pPr>
     <w:r>
@@ -22913,7 +22877,7 @@
       <w:jc w:val="left"/>
     </w:pPr>
     <w:rPr>
-      <w:rFonts w:eastAsia="DejaVu Sans" w:ascii="Calibri" w:hAnsi="Calibri" w:cs="Noto Sans Arabic UI"/>
+      <w:rFonts w:ascii="Calibri" w:hAnsi="Calibri" w:eastAsia="DejaVu Sans" w:cs="Noto Sans Arabic UI"/>
       <w:color w:val="auto"/>
       <w:kern w:val="0"/>
       <w:sz w:val="22"/>

</xml_diff>